<commit_message>
docs: update readme, README and user guide to v1.5.0
- readme.txt: bump Stable tag 1.0.0 -> 1.5.0, full changelog for all releases
- README.md: document Speculation Rules, Remove Unused CSS, dependency-tree
  safety, and the Security module; add new Surrogate-Keys and hooks; remove a
  stale hook reference (flavor_edge_preload_limit) that never existed in code
- User guide (.docx): add sections for Remove Unused CSS, background-image lazy
  load, JS dependency safety, Speculation Rules and Security; bump to v1.5
</commit_message>
<xml_diff>
--- a/doc/guia-usuario-transparent-edge-cache.docx
+++ b/doc/guia-usuario-transparent-edge-cache.docx
@@ -99,7 +99,7 @@
           <w:sz w:val="22"/>
           <w:szCs w:val="22"/>
         </w:rPr>
-        <w:t xml:space="preserve">Versión 1.0 — Marzo 2026</w:t>
+        <w:t xml:space="preserve">Versión 1.5 — Septiembre 2026</w:t>
       </w:r>
     </w:p>
     <w:p>
@@ -5410,18 +5410,320 @@
     </w:p>
     <w:p>
       <w:pPr>
+        <w:pStyle w:val="Heading2"/>
+      </w:pPr>
+      <w:r>
+        <w:t xml:space="preserve">8.11. Eliminar CSS no usado (Remove Unused CSS)</w:t>
+      </w:r>
+    </w:p>
+    <w:p>
+      <w:pPr>
+        <w:spacing w:after="160" w:line="276"/>
+      </w:pPr>
+      <w:r>
+        <w:rPr>
+          <w:rFonts w:ascii="Plus Jakarta Sans" w:cs="Plus Jakarta Sans" w:eastAsia="Plus Jakarta Sans" w:hAnsi="Plus Jakarta Sans"/>
+          <w:sz w:val="22"/>
+          <w:szCs w:val="22"/>
+        </w:rPr>
+        <w:t xml:space="preserve">Esta es una de las optimizaciones de mayor impacto en el </w:t>
+      </w:r>
+      <w:r>
+        <w:rPr>
+          <w:rFonts w:ascii="Plus Jakarta Sans" w:cs="Plus Jakarta Sans" w:eastAsia="Plus Jakarta Sans" w:hAnsi="Plus Jakarta Sans"/>
+          <w:b/>
+          <w:bCs/>
+          <w:sz w:val="22"/>
+          <w:szCs w:val="22"/>
+        </w:rPr>
+        <w:t xml:space="preserve">LCP</w:t>
+      </w:r>
+      <w:r>
+        <w:rPr>
+          <w:rFonts w:ascii="Plus Jakarta Sans" w:cs="Plus Jakarta Sans" w:eastAsia="Plus Jakarta Sans" w:hAnsi="Plus Jakarta Sans"/>
+          <w:sz w:val="22"/>
+          <w:szCs w:val="22"/>
+        </w:rPr>
+        <w:t xml:space="preserve"> (Largest Contentful Paint). Analiza cada plantilla de tu sitio (portada, entradas, páginas, archivos) y genera una versión del CSS que contiene </w:t>
+      </w:r>
+      <w:r>
+        <w:rPr>
+          <w:rFonts w:ascii="Plus Jakarta Sans" w:cs="Plus Jakarta Sans" w:eastAsia="Plus Jakarta Sans" w:hAnsi="Plus Jakarta Sans"/>
+          <w:b/>
+          <w:bCs/>
+          <w:sz w:val="22"/>
+          <w:szCs w:val="22"/>
+        </w:rPr>
+        <w:t xml:space="preserve">únicamente las reglas que esa plantilla usa realmente</w:t>
+      </w:r>
+      <w:r>
+        <w:rPr>
+          <w:rFonts w:ascii="Plus Jakarta Sans" w:cs="Plus Jakarta Sans" w:eastAsia="Plus Jakarta Sans" w:hAnsi="Plus Jakarta Sans"/>
+          <w:sz w:val="22"/>
+          <w:szCs w:val="22"/>
+        </w:rPr>
+        <w:t xml:space="preserve">. El resto se carga de forma diferida.</w:t>
+      </w:r>
+    </w:p>
+    <w:p>
+      <w:pPr>
+        <w:spacing w:after="160" w:line="276"/>
+      </w:pPr>
+      <w:r>
+        <w:rPr>
+          <w:rFonts w:ascii="Plus Jakarta Sans" w:cs="Plus Jakarta Sans" w:eastAsia="Plus Jakarta Sans" w:hAnsi="Plus Jakarta Sans"/>
+          <w:sz w:val="22"/>
+          <w:szCs w:val="22"/>
+        </w:rPr>
+        <w:t xml:space="preserve">La generación se hace en segundo plano, sin bloquear a los visitantes: la primera vez que se visita una plantilla, el plugin programa el cálculo y sirve el CSS original; una vez generado, sirve la versión optimizada inline en la cabecera.</w:t>
+      </w:r>
+    </w:p>
+    <w:p>
+      <w:pPr>
+        <w:spacing w:after="160" w:line="276"/>
+      </w:pPr>
+      <w:r>
+        <w:rPr>
+          <w:rFonts w:ascii="Plus Jakarta Sans" w:cs="Plus Jakarta Sans" w:eastAsia="Plus Jakarta Sans" w:hAnsi="Plus Jakarta Sans"/>
+          <w:b/>
+          <w:bCs/>
+          <w:sz w:val="22"/>
+          <w:szCs w:val="22"/>
+        </w:rPr>
+        <w:t xml:space="preserve">Seguridad ante fallos: </w:t>
+      </w:r>
+      <w:r>
+        <w:rPr>
+          <w:rFonts w:ascii="Plus Jakarta Sans" w:cs="Plus Jakarta Sans" w:eastAsia="Plus Jakarta Sans" w:hAnsi="Plus Jakarta Sans"/>
+          <w:sz w:val="22"/>
+          <w:szCs w:val="22"/>
+        </w:rPr>
+        <w:t xml:space="preserve">si la generación falla o el directorio de caché no tiene permisos de escritura, el plugin sirve el CSS original sin modificar. Nunca romperá la apariencia de tu sitio.</w:t>
+      </w:r>
+    </w:p>
+    <w:p>
+      <w:pPr>
+        <w:spacing w:after="160" w:line="276"/>
+      </w:pPr>
+      <w:r>
+        <w:rPr>
+          <w:rFonts w:ascii="Plus Jakarta Sans" w:cs="Plus Jakarta Sans" w:eastAsia="Plus Jakarta Sans" w:hAnsi="Plus Jakarta Sans"/>
+          <w:b/>
+          <w:bCs/>
+          <w:sz w:val="22"/>
+          <w:szCs w:val="22"/>
+        </w:rPr>
+        <w:t xml:space="preserve">Exclusiones: </w:t>
+      </w:r>
+      <w:r>
+        <w:rPr>
+          <w:rFonts w:ascii="Plus Jakarta Sans" w:cs="Plus Jakarta Sans" w:eastAsia="Plus Jakarta Sans" w:hAnsi="Plus Jakarta Sans"/>
+          <w:sz w:val="22"/>
+          <w:szCs w:val="22"/>
+        </w:rPr>
+        <w:t xml:space="preserve">puedes indicar handles o fragmentos de URL (uno por línea) que nunca deben tocarse, por si algún componente carga estilos de forma dinámica.</w:t>
+      </w:r>
+    </w:p>
+    <w:p>
+      <w:pPr>
+        <w:spacing w:after="200"/>
+      </w:pPr>
+    </w:p>
+    <w:p>
+      <w:pPr>
+        <w:pStyle w:val="Heading2"/>
+      </w:pPr>
+      <w:r>
+        <w:t xml:space="preserve">8.12. Lazy Load de imágenes de fondo (CSS)</w:t>
+      </w:r>
+    </w:p>
+    <w:p>
+      <w:pPr>
+        <w:spacing w:after="160" w:line="276"/>
+      </w:pPr>
+      <w:r>
+        <w:rPr>
+          <w:rFonts w:ascii="Plus Jakarta Sans" w:cs="Plus Jakarta Sans" w:eastAsia="Plus Jakarta Sans" w:hAnsi="Plus Jakarta Sans"/>
+          <w:sz w:val="22"/>
+          <w:szCs w:val="22"/>
+        </w:rPr>
+        <w:t xml:space="preserve">Además del lazy load de imágenes e iframes, el plugin puede diferir la carga de imágenes de fondo definidas por CSS (mediante estilos inline) hasta que están a punto de entrar en la pantalla, usando IntersectionObserver.</w:t>
+      </w:r>
+    </w:p>
+    <w:p>
+      <w:pPr>
+        <w:spacing w:after="160" w:line="276"/>
+      </w:pPr>
+      <w:r>
+        <w:rPr>
+          <w:rFonts w:ascii="Plus Jakarta Sans" w:cs="Plus Jakarta Sans" w:eastAsia="Plus Jakarta Sans" w:hAnsi="Plus Jakarta Sans"/>
+          <w:b/>
+          <w:bCs/>
+          <w:sz w:val="22"/>
+          <w:szCs w:val="22"/>
+        </w:rPr>
+        <w:t xml:space="preserve">Las dos primeras imágenes de fondo se mantienen activas</w:t>
+      </w:r>
+      <w:r>
+        <w:rPr>
+          <w:rFonts w:ascii="Plus Jakarta Sans" w:cs="Plus Jakarta Sans" w:eastAsia="Plus Jakarta Sans" w:hAnsi="Plus Jakarta Sans"/>
+          <w:sz w:val="22"/>
+          <w:szCs w:val="22"/>
+        </w:rPr>
+        <w:t xml:space="preserve"> para no penalizar el LCP. Si necesitas excluir un elemento concreto, añádele el atributo </w:t>
+      </w:r>
+      <w:r>
+        <w:rPr>
+          <w:rFonts w:ascii="Plus Jakarta Sans" w:cs="Plus Jakarta Sans" w:eastAsia="Plus Jakarta Sans" w:hAnsi="Plus Jakarta Sans"/>
+          <w:sz w:val="22"/>
+          <w:szCs w:val="22"/>
+        </w:rPr>
+        <w:t xml:space="preserve">data-no-lazy</w:t>
+      </w:r>
+    </w:p>
+    <w:p>
+      <w:pPr>
+        <w:spacing w:after="200"/>
+      </w:pPr>
+    </w:p>
+    <w:p>
+      <w:pPr>
+        <w:pStyle w:val="Heading2"/>
+      </w:pPr>
+      <w:r>
+        <w:t xml:space="preserve">8.13. Comportamiento seguro con dependencias de JavaScript</w:t>
+      </w:r>
+    </w:p>
+    <w:p>
+      <w:pPr>
+        <w:spacing w:after="160" w:line="276"/>
+      </w:pPr>
+      <w:r>
+        <w:rPr>
+          <w:rFonts w:ascii="Plus Jakarta Sans" w:cs="Plus Jakarta Sans" w:eastAsia="Plus Jakarta Sans" w:hAnsi="Plus Jakarta Sans"/>
+          <w:sz w:val="22"/>
+          <w:szCs w:val="22"/>
+        </w:rPr>
+        <w:t xml:space="preserve">El Delay JS, Defer JS y Combinar JS respetan automáticamente el </w:t>
+      </w:r>
+      <w:r>
+        <w:rPr>
+          <w:rFonts w:ascii="Plus Jakarta Sans" w:cs="Plus Jakarta Sans" w:eastAsia="Plus Jakarta Sans" w:hAnsi="Plus Jakarta Sans"/>
+          <w:b/>
+          <w:bCs/>
+          <w:sz w:val="22"/>
+          <w:szCs w:val="22"/>
+        </w:rPr>
+        <w:t xml:space="preserve">árbol de dependencias</w:t>
+      </w:r>
+      <w:r>
+        <w:rPr>
+          <w:rFonts w:ascii="Plus Jakarta Sans" w:cs="Plus Jakarta Sans" w:eastAsia="Plus Jakarta Sans" w:hAnsi="Plus Jakarta Sans"/>
+          <w:sz w:val="22"/>
+          <w:szCs w:val="22"/>
+        </w:rPr>
+        <w:t xml:space="preserve"> que WordPress establece entre scripts. Esto significa que el plugin nunca optimizará un script si otro script que no se optimiza depende de él.</w:t>
+      </w:r>
+    </w:p>
+    <w:p>
+      <w:pPr>
+        <w:spacing w:after="160" w:line="276"/>
+      </w:pPr>
+      <w:r>
+        <w:rPr>
+          <w:rFonts w:ascii="Plus Jakarta Sans" w:cs="Plus Jakarta Sans" w:eastAsia="Plus Jakarta Sans" w:hAnsi="Plus Jakarta Sans"/>
+          <w:sz w:val="22"/>
+          <w:szCs w:val="22"/>
+        </w:rPr>
+        <w:t xml:space="preserve">En la práctica, esto evita errores del tipo </w:t>
+      </w:r>
+      <w:r>
+        <w:rPr>
+          <w:rFonts w:ascii="Plus Jakarta Sans" w:cs="Plus Jakarta Sans" w:eastAsia="Plus Jakarta Sans" w:hAnsi="Plus Jakarta Sans"/>
+          <w:b/>
+          <w:bCs/>
+          <w:sz w:val="22"/>
+          <w:szCs w:val="22"/>
+        </w:rPr>
+        <w:t xml:space="preserve">"Backbone is not defined"</w:t>
+      </w:r>
+      <w:r>
+        <w:rPr>
+          <w:rFonts w:ascii="Plus Jakarta Sans" w:cs="Plus Jakarta Sans" w:eastAsia="Plus Jakarta Sans" w:hAnsi="Plus Jakarta Sans"/>
+          <w:sz w:val="22"/>
+          <w:szCs w:val="22"/>
+        </w:rPr>
+        <w:t xml:space="preserve"> o problemas con formularios (por ejemplo Ninja Forms) que dependen de librerías como Backbone o Underscore. No necesitas configurar nada ni mantener listas manuales: el plugin lo resuelve solo leyendo las dependencias declaradas por cada plugin y tema.</w:t>
+      </w:r>
+    </w:p>
+    <w:p>
+      <w:pPr>
+        <w:spacing w:after="200"/>
+      </w:pPr>
+    </w:p>
+    <w:p>
+      <w:pPr>
         <w:pStyle w:val="Heading1"/>
       </w:pPr>
       <w:r>
-        <w:t xml:space="preserve">9. Configuración Avanzada</w:t>
-      </w:r>
+        <w:t xml:space="preserve">9. Speculation Rules (prefetch y prerender)</w:t>
+      </w:r>
+    </w:p>
+    <w:p>
+      <w:pPr>
+        <w:spacing w:after="160" w:line="276"/>
+      </w:pPr>
+      <w:r>
+        <w:rPr>
+          <w:rFonts w:ascii="Plus Jakarta Sans" w:cs="Plus Jakarta Sans" w:eastAsia="Plus Jakarta Sans" w:hAnsi="Plus Jakarta Sans"/>
+          <w:sz w:val="22"/>
+          <w:szCs w:val="22"/>
+        </w:rPr>
+        <w:t xml:space="preserve">Las </w:t>
+      </w:r>
+      <w:r>
+        <w:rPr>
+          <w:rFonts w:ascii="Plus Jakarta Sans" w:cs="Plus Jakarta Sans" w:eastAsia="Plus Jakarta Sans" w:hAnsi="Plus Jakarta Sans"/>
+          <w:b/>
+          <w:bCs/>
+          <w:sz w:val="22"/>
+          <w:szCs w:val="22"/>
+        </w:rPr>
+        <w:t xml:space="preserve">Speculation Rules</w:t>
+      </w:r>
+      <w:r>
+        <w:rPr>
+          <w:rFonts w:ascii="Plus Jakarta Sans" w:cs="Plus Jakarta Sans" w:eastAsia="Plus Jakarta Sans" w:hAnsi="Plus Jakarta Sans"/>
+          <w:sz w:val="22"/>
+          <w:szCs w:val="22"/>
+        </w:rPr>
+        <w:t xml:space="preserve"> son un estándar moderno que permite al navegador cargar por adelantado las páginas que el visitante probablemente va a visitar. Cuando el usuario hace clic, la página aparece de forma casi instantánea.</w:t>
+      </w:r>
+    </w:p>
+    <w:p>
+      <w:pPr>
+        <w:spacing w:after="160" w:line="276"/>
+      </w:pPr>
+      <w:r>
+        <w:rPr>
+          <w:rFonts w:ascii="Plus Jakarta Sans" w:cs="Plus Jakarta Sans" w:eastAsia="Plus Jakarta Sans" w:hAnsi="Plus Jakarta Sans"/>
+          <w:sz w:val="22"/>
+          <w:szCs w:val="22"/>
+        </w:rPr>
+        <w:t xml:space="preserve">El plugin genera estas reglas automáticamente y las coordina con la CDN, con exclusiones inteligentes para no precargar páginas que no deben cachearse (carrito, checkout, área de cliente, formularios, etc.).</w:t>
+      </w:r>
+    </w:p>
+    <w:p>
+      <w:pPr>
+        <w:spacing w:after="200"/>
+      </w:pPr>
     </w:p>
     <w:p>
       <w:pPr>
         <w:pStyle w:val="Heading2"/>
       </w:pPr>
       <w:r>
-        <w:t xml:space="preserve">9.1. URLs excluidas</w:t>
+        <w:t xml:space="preserve">9.1. Modos de funcionamiento</w:t>
       </w:r>
     </w:p>
     <w:p>
@@ -5431,18 +5733,79 @@
       <w:r>
         <w:rPr>
           <w:rFonts w:ascii="Plus Jakarta Sans" w:cs="Plus Jakarta Sans" w:eastAsia="Plus Jakarta Sans" w:hAnsi="Plus Jakarta Sans"/>
-          <w:sz w:val="22"/>
-          <w:szCs w:val="22"/>
-        </w:rPr>
-        <w:t xml:space="preserve">URLs que nunca deben cachearse. Un patrón por línea, soporta expresiones regulares. Ejemplo: /mi-pagina-privada/ o /api/.</w:t>
-      </w:r>
+          <w:b/>
+          <w:bCs/>
+          <w:sz w:val="22"/>
+          <w:szCs w:val="22"/>
+        </w:rPr>
+        <w:t xml:space="preserve">Conservador: </w:t>
+      </w:r>
+      <w:r>
+        <w:rPr>
+          <w:rFonts w:ascii="Plus Jakarta Sans" w:cs="Plus Jakarta Sans" w:eastAsia="Plus Jakarta Sans" w:hAnsi="Plus Jakarta Sans"/>
+          <w:sz w:val="22"/>
+          <w:szCs w:val="22"/>
+        </w:rPr>
+        <w:t xml:space="preserve">solo precarga al hacer clic o al pulsar el botón del ratón. Es el modo de menor carga para el origen. Recomendado para sitios de alto tráfico o con mid-tier dedicado.</w:t>
+      </w:r>
+    </w:p>
+    <w:p>
+      <w:pPr>
+        <w:spacing w:after="160" w:line="276"/>
+      </w:pPr>
+      <w:r>
+        <w:rPr>
+          <w:rFonts w:ascii="Plus Jakarta Sans" w:cs="Plus Jakarta Sans" w:eastAsia="Plus Jakarta Sans" w:hAnsi="Plus Jakarta Sans"/>
+          <w:b/>
+          <w:bCs/>
+          <w:sz w:val="22"/>
+          <w:szCs w:val="22"/>
+        </w:rPr>
+        <w:t xml:space="preserve">Equilibrado: </w:t>
+      </w:r>
+      <w:r>
+        <w:rPr>
+          <w:rFonts w:ascii="Plus Jakarta Sans" w:cs="Plus Jakarta Sans" w:eastAsia="Plus Jakarta Sans" w:hAnsi="Plus Jakarta Sans"/>
+          <w:sz w:val="22"/>
+          <w:szCs w:val="22"/>
+        </w:rPr>
+        <w:t xml:space="preserve">precarga al pasar el ratón por encima de un enlace (hover). Buen equilibrio entre velocidad y carga. Recomendado para la mayoría de sitios.</w:t>
+      </w:r>
+    </w:p>
+    <w:p>
+      <w:pPr>
+        <w:spacing w:after="160" w:line="276"/>
+      </w:pPr>
+      <w:r>
+        <w:rPr>
+          <w:rFonts w:ascii="Plus Jakarta Sans" w:cs="Plus Jakarta Sans" w:eastAsia="Plus Jakarta Sans" w:hAnsi="Plus Jakarta Sans"/>
+          <w:b/>
+          <w:bCs/>
+          <w:sz w:val="22"/>
+          <w:szCs w:val="22"/>
+        </w:rPr>
+        <w:t xml:space="preserve">Agresivo: </w:t>
+      </w:r>
+      <w:r>
+        <w:rPr>
+          <w:rFonts w:ascii="Plus Jakarta Sans" w:cs="Plus Jakarta Sans" w:eastAsia="Plus Jakarta Sans" w:hAnsi="Plus Jakarta Sans"/>
+          <w:sz w:val="22"/>
+          <w:szCs w:val="22"/>
+        </w:rPr>
+        <w:t xml:space="preserve">precarga al hover y además hace prerender (renderizado completo) al hacer clic. Es el más rápido, pero ejecuta JavaScript en las páginas especuladas, lo que puede disparar analítica o píxeles de remarketing antes de que el usuario visite realmente la página. Requiere confirmación explícita al activarlo.</w:t>
+      </w:r>
+    </w:p>
+    <w:p>
+      <w:pPr>
+        <w:spacing w:after="200"/>
+      </w:pPr>
     </w:p>
     <w:p>
       <w:pPr>
         <w:pStyle w:val="Heading2"/>
       </w:pPr>
       <w:r>
-        <w:t xml:space="preserve">9.2. Cookies excluidas</w:t>
+        <w:t xml:space="preserve">9.2. Tipos de contenido</w:t>
       </w:r>
     </w:p>
     <w:p>
@@ -5455,15 +5818,20 @@
           <w:sz w:val="22"/>
           <w:szCs w:val="22"/>
         </w:rPr>
-        <w:t xml:space="preserve">Si un visitante tiene alguna de estas cookies, la página no se cachea. Útil para páginas con contenido personalizado. Las cookies de WordPress y WooCommerce ya están incluidas por defecto.</w:t>
-      </w:r>
+        <w:t xml:space="preserve">Puedes elegir qué tipos de contenido se precargan (entradas, páginas, productos, etc.). Los enlaces a tipos no seleccionados quedan excluidos de la especulación.</w:t>
+      </w:r>
+    </w:p>
+    <w:p>
+      <w:pPr>
+        <w:spacing w:after="200"/>
+      </w:pPr>
     </w:p>
     <w:p>
       <w:pPr>
         <w:pStyle w:val="Heading2"/>
       </w:pPr>
       <w:r>
-        <w:t xml:space="preserve">9.3. Query Strings ignorados</w:t>
+        <w:t xml:space="preserve">9.3. Inyección de la cabecera</w:t>
       </w:r>
     </w:p>
     <w:p>
@@ -5473,18 +5841,87 @@
       <w:r>
         <w:rPr>
           <w:rFonts w:ascii="Plus Jakarta Sans" w:cs="Plus Jakarta Sans" w:eastAsia="Plus Jakarta Sans" w:hAnsi="Plus Jakarta Sans"/>
-          <w:sz w:val="22"/>
-          <w:szCs w:val="22"/>
-        </w:rPr>
-        <w:t xml:space="preserve">Los parámetros de tracking (UTM, fbclid, gclid, etc.) crean entradas de caché duplicadas. El plugin genera un snippet VCL que usa urlplus para eliminarlos de la clave de caché. Los parámetros más comunes ya están configurados por defecto.</w:t>
-      </w:r>
+          <w:b/>
+          <w:bCs/>
+          <w:sz w:val="22"/>
+          <w:szCs w:val="22"/>
+        </w:rPr>
+        <w:t xml:space="preserve">PHP (origen): </w:t>
+      </w:r>
+      <w:r>
+        <w:rPr>
+          <w:rFonts w:ascii="Plus Jakarta Sans" w:cs="Plus Jakarta Sans" w:eastAsia="Plus Jakarta Sans" w:hAnsi="Plus Jakarta Sans"/>
+          <w:sz w:val="22"/>
+          <w:szCs w:val="22"/>
+        </w:rPr>
+        <w:t xml:space="preserve">la cabecera la añade WordPress. Funciona sin configuración adicional.</w:t>
+      </w:r>
+    </w:p>
+    <w:p>
+      <w:pPr>
+        <w:spacing w:after="160" w:line="276"/>
+      </w:pPr>
+      <w:r>
+        <w:rPr>
+          <w:rFonts w:ascii="Plus Jakarta Sans" w:cs="Plus Jakarta Sans" w:eastAsia="Plus Jakarta Sans" w:hAnsi="Plus Jakarta Sans"/>
+          <w:b/>
+          <w:bCs/>
+          <w:sz w:val="22"/>
+          <w:szCs w:val="22"/>
+        </w:rPr>
+        <w:t xml:space="preserve">VCL (edge): </w:t>
+      </w:r>
+      <w:r>
+        <w:rPr>
+          <w:rFonts w:ascii="Plus Jakarta Sans" w:cs="Plus Jakarta Sans" w:eastAsia="Plus Jakarta Sans" w:hAnsi="Plus Jakarta Sans"/>
+          <w:sz w:val="22"/>
+          <w:szCs w:val="22"/>
+        </w:rPr>
+        <w:t xml:space="preserve">la cabecera la añade Varnish en el edge. Es más eficiente. El plugin genera el snippet VCL recomendado que copias y aplicas desde tu panel de Transparent Edge.</w:t>
+      </w:r>
+    </w:p>
+    <w:p>
+      <w:pPr>
+        <w:spacing w:after="160" w:line="276"/>
+      </w:pPr>
+      <w:r>
+        <w:rPr>
+          <w:rFonts w:ascii="Plus Jakarta Sans" w:cs="Plus Jakarta Sans" w:eastAsia="Plus Jakarta Sans" w:hAnsi="Plus Jakarta Sans"/>
+          <w:sz w:val="22"/>
+          <w:szCs w:val="22"/>
+        </w:rPr>
+        <w:t xml:space="preserve">En cualquier caso, el plugin </w:t>
+      </w:r>
+      <w:r>
+        <w:rPr>
+          <w:rFonts w:ascii="Plus Jakarta Sans" w:cs="Plus Jakarta Sans" w:eastAsia="Plus Jakarta Sans" w:hAnsi="Plus Jakarta Sans"/>
+          <w:b/>
+          <w:bCs/>
+          <w:sz w:val="22"/>
+          <w:szCs w:val="22"/>
+        </w:rPr>
+        <w:t xml:space="preserve">nunca despliega VCL automáticamente</w:t>
+      </w:r>
+      <w:r>
+        <w:rPr>
+          <w:rFonts w:ascii="Plus Jakarta Sans" w:cs="Plus Jakarta Sans" w:eastAsia="Plus Jakarta Sans" w:hAnsi="Plus Jakarta Sans"/>
+          <w:sz w:val="22"/>
+          <w:szCs w:val="22"/>
+        </w:rPr>
+        <w:t xml:space="preserve">: solo genera la recomendación para que la apliques tú.</w:t>
+      </w:r>
+    </w:p>
+    <w:p>
+      <w:pPr>
+        <w:spacing w:after="200"/>
+      </w:pPr>
     </w:p>
     <w:p>
       <w:pPr>
         <w:pStyle w:val="Heading2"/>
       </w:pPr>
       <w:r>
-        <w:t xml:space="preserve">9.4. Control del Heartbeat</w:t>
+        <w:t xml:space="preserve">9.4. Detección de conflictos</w:t>
       </w:r>
     </w:p>
     <w:p>
@@ -5497,7 +5934,134 @@
           <w:sz w:val="22"/>
           <w:szCs w:val="22"/>
         </w:rPr>
-        <w:t xml:space="preserve">WordPress envía peticiones AJAX cada 15-60 segundos para funcionalidades como autoguardado y bloqueo de posts. En sitios con muchos editores, esto genera carga innecesaria. Puedes:</w:t>
+        <w:t xml:space="preserve">Si tienes activo otro plugin que también implementa prefetch o prerender (WordPress Speculative Loading, Flying Pages, la opción Preload Links de WP Rocket, etc.), el plugin lo detecta y te avisa, para que evites precargas duplicadas.</w:t>
+      </w:r>
+    </w:p>
+    <w:p>
+      <w:pPr>
+        <w:spacing w:after="200"/>
+      </w:pPr>
+    </w:p>
+    <w:p>
+      <w:pPr>
+        <w:pStyle w:val="Heading1"/>
+      </w:pPr>
+      <w:r>
+        <w:t xml:space="preserve">10. Seguridad</w:t>
+      </w:r>
+    </w:p>
+    <w:p>
+      <w:pPr>
+        <w:spacing w:after="160" w:line="276"/>
+      </w:pPr>
+      <w:r>
+        <w:rPr>
+          <w:rFonts w:ascii="Plus Jakarta Sans" w:cs="Plus Jakarta Sans" w:eastAsia="Plus Jakarta Sans" w:hAnsi="Plus Jakarta Sans"/>
+          <w:sz w:val="22"/>
+          <w:szCs w:val="22"/>
+        </w:rPr>
+        <w:t xml:space="preserve">El plugin incluye una pestaña de </w:t>
+      </w:r>
+      <w:r>
+        <w:rPr>
+          <w:rFonts w:ascii="Plus Jakarta Sans" w:cs="Plus Jakarta Sans" w:eastAsia="Plus Jakarta Sans" w:hAnsi="Plus Jakarta Sans"/>
+          <w:b/>
+          <w:bCs/>
+          <w:sz w:val="22"/>
+          <w:szCs w:val="22"/>
+        </w:rPr>
+        <w:t xml:space="preserve">Seguridad</w:t>
+      </w:r>
+      <w:r>
+        <w:rPr>
+          <w:rFonts w:ascii="Plus Jakarta Sans" w:cs="Plus Jakarta Sans" w:eastAsia="Plus Jakarta Sans" w:hAnsi="Plus Jakarta Sans"/>
+          <w:sz w:val="22"/>
+          <w:szCs w:val="22"/>
+        </w:rPr>
+        <w:t xml:space="preserve"> que combina protecciones que funcionan en cualquier instalación de WordPress con la integración de los servicios de seguridad de Transparent Edge.</w:t>
+      </w:r>
+    </w:p>
+    <w:p>
+      <w:pPr>
+        <w:spacing w:after="200"/>
+      </w:pPr>
+    </w:p>
+    <w:p>
+      <w:pPr>
+        <w:pStyle w:val="Heading2"/>
+      </w:pPr>
+      <w:r>
+        <w:t xml:space="preserve">10.1. Servicios de seguridad detectados</w:t>
+      </w:r>
+    </w:p>
+    <w:p>
+      <w:pPr>
+        <w:spacing w:after="160" w:line="276"/>
+      </w:pPr>
+      <w:r>
+        <w:rPr>
+          <w:rFonts w:ascii="Plus Jakarta Sans" w:cs="Plus Jakarta Sans" w:eastAsia="Plus Jakarta Sans" w:hAnsi="Plus Jakarta Sans"/>
+          <w:sz w:val="22"/>
+          <w:szCs w:val="22"/>
+        </w:rPr>
+        <w:t xml:space="preserve">En la parte superior de la pestaña verás qué servicios de seguridad tienes contratados con Transparent Edge: </w:t>
+      </w:r>
+      <w:r>
+        <w:rPr>
+          <w:rFonts w:ascii="Plus Jakarta Sans" w:cs="Plus Jakarta Sans" w:eastAsia="Plus Jakarta Sans" w:hAnsi="Plus Jakarta Sans"/>
+          <w:b/>
+          <w:bCs/>
+          <w:sz w:val="22"/>
+          <w:szCs w:val="22"/>
+        </w:rPr>
+        <w:t xml:space="preserve">WAF, Bot Mitigation, Perimetrical y Anti-DDoS</w:t>
+      </w:r>
+      <w:r>
+        <w:rPr>
+          <w:rFonts w:ascii="Plus Jakarta Sans" w:cs="Plus Jakarta Sans" w:eastAsia="Plus Jakarta Sans" w:hAnsi="Plus Jakarta Sans"/>
+          <w:sz w:val="22"/>
+          <w:szCs w:val="22"/>
+        </w:rPr>
+        <w:t xml:space="preserve">. El plugin lo detecta automáticamente desde tu cuenta.</w:t>
+      </w:r>
+    </w:p>
+    <w:p>
+      <w:pPr>
+        <w:spacing w:after="160" w:line="276"/>
+      </w:pPr>
+      <w:r>
+        <w:rPr>
+          <w:rFonts w:ascii="Plus Jakarta Sans" w:cs="Plus Jakarta Sans" w:eastAsia="Plus Jakarta Sans" w:hAnsi="Plus Jakarta Sans"/>
+          <w:sz w:val="22"/>
+          <w:szCs w:val="22"/>
+        </w:rPr>
+        <w:t xml:space="preserve">Las funciones que requieren protección activa (limitación de peticiones, antibot, respuesta automática a anomalías) dependen de tener contratada la suite Perimetrical, y se gestionan desde la plataforma de Transparent Edge, no desde el plugin.</w:t>
+      </w:r>
+    </w:p>
+    <w:p>
+      <w:pPr>
+        <w:spacing w:after="200"/>
+      </w:pPr>
+    </w:p>
+    <w:p>
+      <w:pPr>
+        <w:pStyle w:val="Heading2"/>
+      </w:pPr>
+      <w:r>
+        <w:t xml:space="preserve">10.2. Endurecimiento local (hardening)</w:t>
+      </w:r>
+    </w:p>
+    <w:p>
+      <w:pPr>
+        <w:spacing w:after="160" w:line="276"/>
+      </w:pPr>
+      <w:r>
+        <w:rPr>
+          <w:rFonts w:ascii="Plus Jakarta Sans" w:cs="Plus Jakarta Sans" w:eastAsia="Plus Jakarta Sans" w:hAnsi="Plus Jakarta Sans"/>
+          <w:sz w:val="22"/>
+          <w:szCs w:val="22"/>
+        </w:rPr>
+        <w:t xml:space="preserve">Estas protecciones funcionan a nivel de WordPress y están disponibles para todos los clientes, tengan o no servicios de seguridad contratados:</w:t>
       </w:r>
     </w:p>
     <w:p>
@@ -5512,28 +6076,20 @@
       <w:r>
         <w:rPr>
           <w:rFonts w:ascii="Plus Jakarta Sans" w:cs="Plus Jakarta Sans" w:eastAsia="Plus Jakarta Sans" w:hAnsi="Plus Jakarta Sans"/>
-          <w:sz w:val="22"/>
-          <w:szCs w:val="22"/>
-        </w:rPr>
-        <w:t xml:space="preserve"/>
-      </w:r>
-      <w:r>
-        <w:rPr>
-          <w:rFonts w:ascii="Plus Jakarta Sans" w:cs="Plus Jakarta Sans" w:eastAsia="Plus Jakarta Sans" w:hAnsi="Plus Jakarta Sans"/>
           <w:b/>
           <w:bCs/>
           <w:sz w:val="22"/>
           <w:szCs w:val="22"/>
         </w:rPr>
-        <w:t xml:space="preserve">Reducir frecuencia</w:t>
-      </w:r>
-      <w:r>
-        <w:rPr>
-          <w:rFonts w:ascii="Plus Jakarta Sans" w:cs="Plus Jakarta Sans" w:eastAsia="Plus Jakarta Sans" w:hAnsi="Plus Jakarta Sans"/>
-          <w:sz w:val="22"/>
-          <w:szCs w:val="22"/>
-        </w:rPr>
-        <w:t xml:space="preserve">: Cambiar el intervalo a 60 o 120 segundos</w:t>
+        <w:t xml:space="preserve">Bloquear PHP en uploads: </w:t>
+      </w:r>
+      <w:r>
+        <w:rPr>
+          <w:rFonts w:ascii="Plus Jakarta Sans" w:cs="Plus Jakarta Sans" w:eastAsia="Plus Jakarta Sans" w:hAnsi="Plus Jakarta Sans"/>
+          <w:sz w:val="22"/>
+          <w:szCs w:val="22"/>
+        </w:rPr>
+        <w:t xml:space="preserve">impide la ejecución de archivos PHP dentro de /wp-content/uploads/, un vector de ataque habitual. En Apache se aplica automáticamente vía .htaccess; en Nginx se muestra la regla equivalente.</w:t>
       </w:r>
     </w:p>
     <w:p>
@@ -5548,28 +6104,20 @@
       <w:r>
         <w:rPr>
           <w:rFonts w:ascii="Plus Jakarta Sans" w:cs="Plus Jakarta Sans" w:eastAsia="Plus Jakarta Sans" w:hAnsi="Plus Jakarta Sans"/>
-          <w:sz w:val="22"/>
-          <w:szCs w:val="22"/>
-        </w:rPr>
-        <w:t xml:space="preserve"/>
-      </w:r>
-      <w:r>
-        <w:rPr>
-          <w:rFonts w:ascii="Plus Jakarta Sans" w:cs="Plus Jakarta Sans" w:eastAsia="Plus Jakarta Sans" w:hAnsi="Plus Jakarta Sans"/>
           <w:b/>
           <w:bCs/>
           <w:sz w:val="22"/>
           <w:szCs w:val="22"/>
         </w:rPr>
-        <w:t xml:space="preserve">Desactivar en admin</w:t>
-      </w:r>
-      <w:r>
-        <w:rPr>
-          <w:rFonts w:ascii="Plus Jakarta Sans" w:cs="Plus Jakarta Sans" w:eastAsia="Plus Jakarta Sans" w:hAnsi="Plus Jakarta Sans"/>
-          <w:sz w:val="22"/>
-          <w:szCs w:val="22"/>
-        </w:rPr>
-        <w:t xml:space="preserve">: Elimina el Heartbeat del panel de administración (excepto el editor)</w:t>
+        <w:t xml:space="preserve">Desactivar XML-RPC: </w:t>
+      </w:r>
+      <w:r>
+        <w:rPr>
+          <w:rFonts w:ascii="Plus Jakarta Sans" w:cs="Plus Jakarta Sans" w:eastAsia="Plus Jakarta Sans" w:hAnsi="Plus Jakarta Sans"/>
+          <w:sz w:val="22"/>
+          <w:szCs w:val="22"/>
+        </w:rPr>
+        <w:t xml:space="preserve">desactiva xmlrpc.php, salvo que uses Jetpack o la app móvil de WordPress.</w:t>
       </w:r>
     </w:p>
     <w:p>
@@ -5584,28 +6132,20 @@
       <w:r>
         <w:rPr>
           <w:rFonts w:ascii="Plus Jakarta Sans" w:cs="Plus Jakarta Sans" w:eastAsia="Plus Jakarta Sans" w:hAnsi="Plus Jakarta Sans"/>
-          <w:sz w:val="22"/>
-          <w:szCs w:val="22"/>
-        </w:rPr>
-        <w:t xml:space="preserve"/>
-      </w:r>
-      <w:r>
-        <w:rPr>
-          <w:rFonts w:ascii="Plus Jakarta Sans" w:cs="Plus Jakarta Sans" w:eastAsia="Plus Jakarta Sans" w:hAnsi="Plus Jakarta Sans"/>
           <w:b/>
           <w:bCs/>
           <w:sz w:val="22"/>
           <w:szCs w:val="22"/>
         </w:rPr>
-        <w:t xml:space="preserve">Desactivar en editor</w:t>
-      </w:r>
-      <w:r>
-        <w:rPr>
-          <w:rFonts w:ascii="Plus Jakarta Sans" w:cs="Plus Jakarta Sans" w:eastAsia="Plus Jakarta Sans" w:hAnsi="Plus Jakarta Sans"/>
-          <w:sz w:val="22"/>
-          <w:szCs w:val="22"/>
-        </w:rPr>
-        <w:t xml:space="preserve">: Elimina el Heartbeat también del editor de posts. Esto desactiva el autoguardado — usa con precaución.</w:t>
+        <w:t xml:space="preserve">Limitar intentos de acceso: </w:t>
+      </w:r>
+      <w:r>
+        <w:rPr>
+          <w:rFonts w:ascii="Plus Jakarta Sans" w:cs="Plus Jakarta Sans" w:eastAsia="Plus Jakarta Sans" w:hAnsi="Plus Jakarta Sans"/>
+          <w:sz w:val="22"/>
+          <w:szCs w:val="22"/>
+        </w:rPr>
+        <w:t xml:space="preserve">bloquea temporalmente una IP tras varios intentos fallidos de login, mitigando ataques de fuerza bruta.</w:t>
       </w:r>
     </w:p>
     <w:p>
@@ -5615,10 +6155,106 @@
     </w:p>
     <w:p>
       <w:pPr>
+        <w:pStyle w:val="Heading2"/>
+      </w:pPr>
+      <w:r>
+        <w:t xml:space="preserve">10.3. Cabeceras de seguridad</w:t>
+      </w:r>
+    </w:p>
+    <w:p>
+      <w:pPr>
+        <w:spacing w:after="160" w:line="276"/>
+      </w:pPr>
+      <w:r>
+        <w:rPr>
+          <w:rFonts w:ascii="Plus Jakarta Sans" w:cs="Plus Jakarta Sans" w:eastAsia="Plus Jakarta Sans" w:hAnsi="Plus Jakarta Sans"/>
+          <w:sz w:val="22"/>
+          <w:szCs w:val="22"/>
+        </w:rPr>
+        <w:t xml:space="preserve">El plugin te ayuda a configurar las principales cabeceras de seguridad HTTP (Content-Security-Policy, Strict-Transport-Security, X-Content-Type-Options, X-Frame-Options, Referrer-Policy y Permissions-Policy).</w:t>
+      </w:r>
+    </w:p>
+    <w:p>
+      <w:pPr>
+        <w:spacing w:after="160" w:line="276"/>
+      </w:pPr>
+      <w:r>
+        <w:rPr>
+          <w:rFonts w:ascii="Plus Jakarta Sans" w:cs="Plus Jakarta Sans" w:eastAsia="Plus Jakarta Sans" w:hAnsi="Plus Jakarta Sans"/>
+          <w:sz w:val="22"/>
+          <w:szCs w:val="22"/>
+        </w:rPr>
+        <w:t xml:space="preserve">Siguiendo el mismo principio que el resto del plugin, </w:t>
+      </w:r>
+      <w:r>
+        <w:rPr>
+          <w:rFonts w:ascii="Plus Jakarta Sans" w:cs="Plus Jakarta Sans" w:eastAsia="Plus Jakarta Sans" w:hAnsi="Plus Jakarta Sans"/>
+          <w:b/>
+          <w:bCs/>
+          <w:sz w:val="22"/>
+          <w:szCs w:val="22"/>
+        </w:rPr>
+        <w:t xml:space="preserve">genera un snippet VCL recomendado</w:t>
+      </w:r>
+      <w:r>
+        <w:rPr>
+          <w:rFonts w:ascii="Plus Jakarta Sans" w:cs="Plus Jakarta Sans" w:eastAsia="Plus Jakarta Sans" w:hAnsi="Plus Jakarta Sans"/>
+          <w:sz w:val="22"/>
+          <w:szCs w:val="22"/>
+        </w:rPr>
+        <w:t xml:space="preserve"> que aplicas desde tu panel de Transparent Edge. También ofrece una opción de emitirlas desde PHP como alternativa si no puedes aplicar el VCL.</w:t>
+      </w:r>
+    </w:p>
+    <w:p>
+      <w:pPr>
+        <w:spacing w:after="160" w:line="276"/>
+      </w:pPr>
+      <w:r>
+        <w:rPr>
+          <w:rFonts w:ascii="Plus Jakarta Sans" w:cs="Plus Jakarta Sans" w:eastAsia="Plus Jakarta Sans" w:hAnsi="Plus Jakarta Sans"/>
+          <w:sz w:val="22"/>
+          <w:szCs w:val="22"/>
+        </w:rPr>
+        <w:t xml:space="preserve">La cabecera Content-Security-Policy (CSP) arranca por defecto en modo </w:t>
+      </w:r>
+      <w:r>
+        <w:rPr>
+          <w:rFonts w:ascii="Plus Jakarta Sans" w:cs="Plus Jakarta Sans" w:eastAsia="Plus Jakarta Sans" w:hAnsi="Plus Jakarta Sans"/>
+          <w:b/>
+          <w:bCs/>
+          <w:sz w:val="22"/>
+          <w:szCs w:val="22"/>
+        </w:rPr>
+        <w:t xml:space="preserve">Report-Only</w:t>
+      </w:r>
+      <w:r>
+        <w:rPr>
+          <w:rFonts w:ascii="Plus Jakarta Sans" w:cs="Plus Jakarta Sans" w:eastAsia="Plus Jakarta Sans" w:hAnsi="Plus Jakarta Sans"/>
+          <w:sz w:val="22"/>
+          <w:szCs w:val="22"/>
+        </w:rPr>
+        <w:t xml:space="preserve">: registra violaciones sin bloquear nada, para que puedas probarla con seguridad antes de aplicarla en modo estricto.</w:t>
+      </w:r>
+    </w:p>
+    <w:p>
+      <w:pPr>
+        <w:spacing w:after="200"/>
+      </w:pPr>
+    </w:p>
+    <w:p>
+      <w:pPr>
         <w:pStyle w:val="Heading1"/>
       </w:pPr>
       <w:r>
-        <w:t xml:space="preserve">10. WooCommerce</w:t>
+        <w:t xml:space="preserve">11. Configuración Avanzada</w:t>
+      </w:r>
+    </w:p>
+    <w:p>
+      <w:pPr>
+        <w:pStyle w:val="Heading2"/>
+      </w:pPr>
+      <w:r>
+        <w:t xml:space="preserve">11.1. URLs excluidas</w:t>
       </w:r>
     </w:p>
     <w:p>
@@ -5631,20 +6267,70 @@
           <w:sz w:val="22"/>
           <w:szCs w:val="22"/>
         </w:rPr>
-        <w:t xml:space="preserve">Si tienes WooCommerce instalado, el plugin se integra automáticamente:</w:t>
-      </w:r>
-    </w:p>
-    <w:p>
-      <w:pPr>
-        <w:spacing w:after="200"/>
-      </w:pPr>
+        <w:t xml:space="preserve">URLs que nunca deben cachearse. Un patrón por línea, soporta expresiones regulares. Ejemplo: /mi-pagina-privada/ o /api/.</w:t>
+      </w:r>
     </w:p>
     <w:p>
       <w:pPr>
         <w:pStyle w:val="Heading2"/>
       </w:pPr>
       <w:r>
-        <w:t xml:space="preserve">10.1. Páginas excluidas de caché</w:t>
+        <w:t xml:space="preserve">11.2. Cookies excluidas</w:t>
+      </w:r>
+    </w:p>
+    <w:p>
+      <w:pPr>
+        <w:spacing w:after="160" w:line="276"/>
+      </w:pPr>
+      <w:r>
+        <w:rPr>
+          <w:rFonts w:ascii="Plus Jakarta Sans" w:cs="Plus Jakarta Sans" w:eastAsia="Plus Jakarta Sans" w:hAnsi="Plus Jakarta Sans"/>
+          <w:sz w:val="22"/>
+          <w:szCs w:val="22"/>
+        </w:rPr>
+        <w:t xml:space="preserve">Si un visitante tiene alguna de estas cookies, la página no se cachea. Útil para páginas con contenido personalizado. Las cookies de WordPress y WooCommerce ya están incluidas por defecto.</w:t>
+      </w:r>
+    </w:p>
+    <w:p>
+      <w:pPr>
+        <w:pStyle w:val="Heading2"/>
+      </w:pPr>
+      <w:r>
+        <w:t xml:space="preserve">11.3. Query Strings ignorados</w:t>
+      </w:r>
+    </w:p>
+    <w:p>
+      <w:pPr>
+        <w:spacing w:after="160" w:line="276"/>
+      </w:pPr>
+      <w:r>
+        <w:rPr>
+          <w:rFonts w:ascii="Plus Jakarta Sans" w:cs="Plus Jakarta Sans" w:eastAsia="Plus Jakarta Sans" w:hAnsi="Plus Jakarta Sans"/>
+          <w:sz w:val="22"/>
+          <w:szCs w:val="22"/>
+        </w:rPr>
+        <w:t xml:space="preserve">Los parámetros de tracking (UTM, fbclid, gclid, etc.) crean entradas de caché duplicadas. El plugin genera un snippet VCL que usa urlplus para eliminarlos de la clave de caché. Los parámetros más comunes ya están configurados por defecto.</w:t>
+      </w:r>
+    </w:p>
+    <w:p>
+      <w:pPr>
+        <w:pStyle w:val="Heading2"/>
+      </w:pPr>
+      <w:r>
+        <w:t xml:space="preserve">11.4. Control del Heartbeat</w:t>
+      </w:r>
+    </w:p>
+    <w:p>
+      <w:pPr>
+        <w:spacing w:after="160" w:line="276"/>
+      </w:pPr>
+      <w:r>
+        <w:rPr>
+          <w:rFonts w:ascii="Plus Jakarta Sans" w:cs="Plus Jakarta Sans" w:eastAsia="Plus Jakarta Sans" w:hAnsi="Plus Jakarta Sans"/>
+          <w:sz w:val="22"/>
+          <w:szCs w:val="22"/>
+        </w:rPr>
+        <w:t xml:space="preserve">WordPress envía peticiones AJAX cada 15-60 segundos para funcionalidades como autoguardado y bloqueo de posts. En sitios con muchos editores, esto genera carga innecesaria. Puedes:</w:t>
       </w:r>
     </w:p>
     <w:p>
@@ -5672,15 +6358,15 @@
           <w:sz w:val="22"/>
           <w:szCs w:val="22"/>
         </w:rPr>
-        <w:t xml:space="preserve">Carrito</w:t>
-      </w:r>
-      <w:r>
-        <w:rPr>
-          <w:rFonts w:ascii="Plus Jakarta Sans" w:cs="Plus Jakarta Sans" w:eastAsia="Plus Jakarta Sans" w:hAnsi="Plus Jakarta Sans"/>
-          <w:sz w:val="22"/>
-          <w:szCs w:val="22"/>
-        </w:rPr>
-        <w:t xml:space="preserve">: Contiene datos únicos por visitante, no debe cachearse</w:t>
+        <w:t xml:space="preserve">Reducir frecuencia</w:t>
+      </w:r>
+      <w:r>
+        <w:rPr>
+          <w:rFonts w:ascii="Plus Jakarta Sans" w:cs="Plus Jakarta Sans" w:eastAsia="Plus Jakarta Sans" w:hAnsi="Plus Jakarta Sans"/>
+          <w:sz w:val="22"/>
+          <w:szCs w:val="22"/>
+        </w:rPr>
+        <w:t xml:space="preserve">: Cambiar el intervalo a 60 o 120 segundos</w:t>
       </w:r>
     </w:p>
     <w:p>
@@ -5708,15 +6394,15 @@
           <w:sz w:val="22"/>
           <w:szCs w:val="22"/>
         </w:rPr>
-        <w:t xml:space="preserve">Checkout</w:t>
-      </w:r>
-      <w:r>
-        <w:rPr>
-          <w:rFonts w:ascii="Plus Jakarta Sans" w:cs="Plus Jakarta Sans" w:eastAsia="Plus Jakarta Sans" w:hAnsi="Plus Jakarta Sans"/>
-          <w:sz w:val="22"/>
-          <w:szCs w:val="22"/>
-        </w:rPr>
-        <w:t xml:space="preserve">: Proceso de pago personalizado</w:t>
+        <w:t xml:space="preserve">Desactivar en admin</w:t>
+      </w:r>
+      <w:r>
+        <w:rPr>
+          <w:rFonts w:ascii="Plus Jakarta Sans" w:cs="Plus Jakarta Sans" w:eastAsia="Plus Jakarta Sans" w:hAnsi="Plus Jakarta Sans"/>
+          <w:sz w:val="22"/>
+          <w:szCs w:val="22"/>
+        </w:rPr>
+        <w:t xml:space="preserve">: Elimina el Heartbeat del panel de administración (excepto el editor)</w:t>
       </w:r>
     </w:p>
     <w:p>
@@ -5744,15 +6430,54 @@
           <w:sz w:val="22"/>
           <w:szCs w:val="22"/>
         </w:rPr>
-        <w:t xml:space="preserve">Mi Cuenta</w:t>
-      </w:r>
-      <w:r>
-        <w:rPr>
-          <w:rFonts w:ascii="Plus Jakarta Sans" w:cs="Plus Jakarta Sans" w:eastAsia="Plus Jakarta Sans" w:hAnsi="Plus Jakarta Sans"/>
-          <w:sz w:val="22"/>
-          <w:szCs w:val="22"/>
-        </w:rPr>
-        <w:t xml:space="preserve">: Datos personales del cliente</w:t>
+        <w:t xml:space="preserve">Desactivar en editor</w:t>
+      </w:r>
+      <w:r>
+        <w:rPr>
+          <w:rFonts w:ascii="Plus Jakarta Sans" w:cs="Plus Jakarta Sans" w:eastAsia="Plus Jakarta Sans" w:hAnsi="Plus Jakarta Sans"/>
+          <w:sz w:val="22"/>
+          <w:szCs w:val="22"/>
+        </w:rPr>
+        <w:t xml:space="preserve">: Elimina el Heartbeat también del editor de posts. Esto desactiva el autoguardado — usa con precaución.</w:t>
+      </w:r>
+    </w:p>
+    <w:p>
+      <w:pPr>
+        <w:spacing w:after="200"/>
+      </w:pPr>
+    </w:p>
+    <w:p>
+      <w:pPr>
+        <w:pStyle w:val="Heading1"/>
+      </w:pPr>
+      <w:r>
+        <w:t xml:space="preserve">12. WooCommerce</w:t>
+      </w:r>
+    </w:p>
+    <w:p>
+      <w:pPr>
+        <w:spacing w:after="160" w:line="276"/>
+      </w:pPr>
+      <w:r>
+        <w:rPr>
+          <w:rFonts w:ascii="Plus Jakarta Sans" w:cs="Plus Jakarta Sans" w:eastAsia="Plus Jakarta Sans" w:hAnsi="Plus Jakarta Sans"/>
+          <w:sz w:val="22"/>
+          <w:szCs w:val="22"/>
+        </w:rPr>
+        <w:t xml:space="preserve">Si tienes WooCommerce instalado, el plugin se integra automáticamente:</w:t>
+      </w:r>
+    </w:p>
+    <w:p>
+      <w:pPr>
+        <w:spacing w:after="200"/>
+      </w:pPr>
+    </w:p>
+    <w:p>
+      <w:pPr>
+        <w:pStyle w:val="Heading2"/>
+      </w:pPr>
+      <w:r>
+        <w:t xml:space="preserve">12.1. Páginas excluidas de caché</w:t>
       </w:r>
     </w:p>
     <w:p>
@@ -5780,6 +6505,114 @@
           <w:sz w:val="22"/>
           <w:szCs w:val="22"/>
         </w:rPr>
+        <w:t xml:space="preserve">Carrito</w:t>
+      </w:r>
+      <w:r>
+        <w:rPr>
+          <w:rFonts w:ascii="Plus Jakarta Sans" w:cs="Plus Jakarta Sans" w:eastAsia="Plus Jakarta Sans" w:hAnsi="Plus Jakarta Sans"/>
+          <w:sz w:val="22"/>
+          <w:szCs w:val="22"/>
+        </w:rPr>
+        <w:t xml:space="preserve">: Contiene datos únicos por visitante, no debe cachearse</w:t>
+      </w:r>
+    </w:p>
+    <w:p>
+      <w:pPr>
+        <w:pStyle w:val="ListParagraph"/>
+        <w:numPr>
+          <w:ilvl w:val="0"/>
+          <w:numId w:val="2"/>
+        </w:numPr>
+        <w:spacing w:after="80" w:line="276"/>
+      </w:pPr>
+      <w:r>
+        <w:rPr>
+          <w:rFonts w:ascii="Plus Jakarta Sans" w:cs="Plus Jakarta Sans" w:eastAsia="Plus Jakarta Sans" w:hAnsi="Plus Jakarta Sans"/>
+          <w:sz w:val="22"/>
+          <w:szCs w:val="22"/>
+        </w:rPr>
+        <w:t xml:space="preserve"/>
+      </w:r>
+      <w:r>
+        <w:rPr>
+          <w:rFonts w:ascii="Plus Jakarta Sans" w:cs="Plus Jakarta Sans" w:eastAsia="Plus Jakarta Sans" w:hAnsi="Plus Jakarta Sans"/>
+          <w:b/>
+          <w:bCs/>
+          <w:sz w:val="22"/>
+          <w:szCs w:val="22"/>
+        </w:rPr>
+        <w:t xml:space="preserve">Checkout</w:t>
+      </w:r>
+      <w:r>
+        <w:rPr>
+          <w:rFonts w:ascii="Plus Jakarta Sans" w:cs="Plus Jakarta Sans" w:eastAsia="Plus Jakarta Sans" w:hAnsi="Plus Jakarta Sans"/>
+          <w:sz w:val="22"/>
+          <w:szCs w:val="22"/>
+        </w:rPr>
+        <w:t xml:space="preserve">: Proceso de pago personalizado</w:t>
+      </w:r>
+    </w:p>
+    <w:p>
+      <w:pPr>
+        <w:pStyle w:val="ListParagraph"/>
+        <w:numPr>
+          <w:ilvl w:val="0"/>
+          <w:numId w:val="2"/>
+        </w:numPr>
+        <w:spacing w:after="80" w:line="276"/>
+      </w:pPr>
+      <w:r>
+        <w:rPr>
+          <w:rFonts w:ascii="Plus Jakarta Sans" w:cs="Plus Jakarta Sans" w:eastAsia="Plus Jakarta Sans" w:hAnsi="Plus Jakarta Sans"/>
+          <w:sz w:val="22"/>
+          <w:szCs w:val="22"/>
+        </w:rPr>
+        <w:t xml:space="preserve"/>
+      </w:r>
+      <w:r>
+        <w:rPr>
+          <w:rFonts w:ascii="Plus Jakarta Sans" w:cs="Plus Jakarta Sans" w:eastAsia="Plus Jakarta Sans" w:hAnsi="Plus Jakarta Sans"/>
+          <w:b/>
+          <w:bCs/>
+          <w:sz w:val="22"/>
+          <w:szCs w:val="22"/>
+        </w:rPr>
+        <w:t xml:space="preserve">Mi Cuenta</w:t>
+      </w:r>
+      <w:r>
+        <w:rPr>
+          <w:rFonts w:ascii="Plus Jakarta Sans" w:cs="Plus Jakarta Sans" w:eastAsia="Plus Jakarta Sans" w:hAnsi="Plus Jakarta Sans"/>
+          <w:sz w:val="22"/>
+          <w:szCs w:val="22"/>
+        </w:rPr>
+        <w:t xml:space="preserve">: Datos personales del cliente</w:t>
+      </w:r>
+    </w:p>
+    <w:p>
+      <w:pPr>
+        <w:pStyle w:val="ListParagraph"/>
+        <w:numPr>
+          <w:ilvl w:val="0"/>
+          <w:numId w:val="2"/>
+        </w:numPr>
+        <w:spacing w:after="80" w:line="276"/>
+      </w:pPr>
+      <w:r>
+        <w:rPr>
+          <w:rFonts w:ascii="Plus Jakarta Sans" w:cs="Plus Jakarta Sans" w:eastAsia="Plus Jakarta Sans" w:hAnsi="Plus Jakarta Sans"/>
+          <w:sz w:val="22"/>
+          <w:szCs w:val="22"/>
+        </w:rPr>
+        <w:t xml:space="preserve"/>
+      </w:r>
+      <w:r>
+        <w:rPr>
+          <w:rFonts w:ascii="Plus Jakarta Sans" w:cs="Plus Jakarta Sans" w:eastAsia="Plus Jakarta Sans" w:hAnsi="Plus Jakarta Sans"/>
+          <w:b/>
+          <w:bCs/>
+          <w:sz w:val="22"/>
+          <w:szCs w:val="22"/>
+        </w:rPr>
         <w:t xml:space="preserve">Página de confirmación de pedido</w:t>
       </w:r>
       <w:r>
@@ -5801,7 +6634,7 @@
         <w:pStyle w:val="Heading2"/>
       </w:pPr>
       <w:r>
-        <w:t xml:space="preserve">10.2. Invalidación de productos</w:t>
+        <w:t xml:space="preserve">12.2. Invalidación de productos</w:t>
       </w:r>
     </w:p>
     <w:tbl>
@@ -6181,7 +7014,7 @@
         <w:pStyle w:val="Heading1"/>
       </w:pPr>
       <w:r>
-        <w:t xml:space="preserve">11. Object Cache</w:t>
+        <w:t xml:space="preserve">13. Object Cache</w:t>
       </w:r>
     </w:p>
     <w:p>
@@ -6284,7 +7117,7 @@
         <w:pStyle w:val="Heading1"/>
       </w:pPr>
       <w:r>
-        <w:t xml:space="preserve">12. WordPress Multisite</w:t>
+        <w:t xml:space="preserve">14. WordPress Multisite</w:t>
       </w:r>
     </w:p>
     <w:p>
@@ -6490,7 +7323,7 @@
         <w:pStyle w:val="Heading1"/>
       </w:pPr>
       <w:r>
-        <w:t xml:space="preserve">13. Resolución de Problemas</w:t>
+        <w:t xml:space="preserve">15. Resolución de Problemas</w:t>
       </w:r>
     </w:p>
     <w:p>
@@ -7297,7 +8130,7 @@
         <w:pStyle w:val="Heading1"/>
       </w:pPr>
       <w:r>
-        <w:t xml:space="preserve">14. Glosario</w:t>
+        <w:t xml:space="preserve">16. Glosario</w:t>
       </w:r>
     </w:p>
     <w:tbl>
@@ -8361,7 +9194,7 @@
         <w:pStyle w:val="Heading1"/>
       </w:pPr>
       <w:r>
-        <w:t xml:space="preserve">15. Soporte</w:t>
+        <w:t xml:space="preserve">17. Soporte</w:t>
       </w:r>
     </w:p>
     <w:p>
@@ -8680,7 +9513,7 @@
         <w:sz w:val="16"/>
         <w:szCs w:val="16"/>
       </w:rPr>
-      <w:t xml:space="preserve">Transparent Edge Cache — Guía de Usuario v1.0</w:t>
+      <w:t xml:space="preserve">Transparent Edge Cache — Guía de Usuario v1.5</w:t>
     </w:r>
   </w:p>
 </w:hdr>

</xml_diff>

<commit_message>
v1.6.0: Origin Shield — origin page cache, homepage profile, Vary neutralisation, inline speculation, cookie guard
Origin page cache that serves anonymous HTML before WordPress boots (disk/Redis/Memcached backends), invalidated by the same purge events as the edge. Dedicated homepage TTL profile (plugin-owned, not a VCL branch). Origin-side Vary neutralisation (never Cookie/User-Agent). Inline Speculation Rules injection by default (no per-navigation endpoint hit). Cookie guard: strip VCL (propose-only) + Set-Cookie/Vary probe. Serve-stale grace/keep VCL recommender. Memcached object-cache drop-in + refuses writing an unsupported drop-in. Hardening from an independent review: never cache Set-Cookie responses, wp-config backup off the webroot, page-cache host allowlist and per-entry size cap. New standalone tests: page-cache engine, homepage profile, cookie guard.
</commit_message>
<xml_diff>
--- a/doc/guia-usuario-transparent-edge-cache.docx
+++ b/doc/guia-usuario-transparent-edge-cache.docx
@@ -2098,7 +2098,7 @@
           <w:sz w:val="22"/>
           <w:szCs w:val="22"/>
         </w:rPr>
-        <w:t xml:space="preserve">Muestra si la caché de objetos está activada (Redis o APCu) y su ratio de aciertos (hit ratio). Un ratio alto (&gt;90%) indica que la mayoría de las consultas a la base de datos se sirven desde memoria, lo que acelera mucho la generación de páginas.</w:t>
+        <w:t>Muestra si la caché de objetos está activada (Redis, Memcached o APCu) y su ratio de aciertos (hit ratio). Un ratio alto (&gt;90%) indica que la mayoría de las consultas a la base de datos se sirven desde memoria, lo que acelera mucho la generación de páginas.</w:t>
       </w:r>
     </w:p>
     <w:p>
@@ -5835,6 +5835,11 @@
       </w:r>
     </w:p>
     <w:p>
+      <w:r>
+        <w:t>Inline (recomendado): las reglas se escriben directamente en el &lt;head&gt; de la página, que el edge ya cachea. No hay ninguna petición extra a un endpoint, así que nada llega al origen solo para entregar las reglas. Es la opción por defecto.</w:t>
+      </w:r>
+    </w:p>
+    <w:p>
       <w:pPr>
         <w:spacing w:after="160" w:line="276"/>
       </w:pPr>
@@ -7027,7 +7032,7 @@
           <w:sz w:val="22"/>
           <w:szCs w:val="22"/>
         </w:rPr>
-        <w:t xml:space="preserve">El Object Cache almacena los resultados de las consultas a la base de datos en memoria (Redis o APCu). Esto reduce drásticamente el número de queries SQL que WordPress necesita para generar una página.</w:t>
+        <w:t>El Object Cache almacena los resultados de las consultas a la base de datos en memoria (Redis, Memcached o APCu). Esto reduce drásticamente el número de queries SQL que WordPress necesita para generar una página.</w:t>
       </w:r>
     </w:p>
     <w:p>
@@ -7058,7 +7063,7 @@
           <w:sz w:val="22"/>
           <w:szCs w:val="22"/>
         </w:rPr>
-        <w:t xml:space="preserve"/>
+        <w:t>Para activarlo: Ve al Dashboard del plugin. Si Redis, Memcached o APCu están disponibles en tu servidor, verás un botón "Activar". Un clic y listo.</w:t>
       </w:r>
       <w:r>
         <w:rPr>
@@ -7068,15 +7073,13 @@
           <w:sz w:val="22"/>
           <w:szCs w:val="22"/>
         </w:rPr>
-        <w:t xml:space="preserve">Para activarlo</w:t>
-      </w:r>
-      <w:r>
-        <w:rPr>
-          <w:rFonts w:ascii="Plus Jakarta Sans" w:cs="Plus Jakarta Sans" w:eastAsia="Plus Jakarta Sans" w:hAnsi="Plus Jakarta Sans"/>
-          <w:sz w:val="22"/>
-          <w:szCs w:val="22"/>
-        </w:rPr>
-        <w:t xml:space="preserve">: Ve al Dashboard del plugin. Si Redis o APCu están disponibles en tu servidor, verás un botón "Activar". Un clic y listo.</w:t>
+      </w:r>
+      <w:r>
+        <w:rPr>
+          <w:rFonts w:ascii="Plus Jakarta Sans" w:cs="Plus Jakarta Sans" w:eastAsia="Plus Jakarta Sans" w:hAnsi="Plus Jakarta Sans"/>
+          <w:sz w:val="22"/>
+          <w:szCs w:val="22"/>
+        </w:rPr>
       </w:r>
     </w:p>
     <w:p>
@@ -7117,7 +7120,162 @@
         <w:pStyle w:val="Heading1"/>
       </w:pPr>
       <w:r>
-        <w:t xml:space="preserve">14. WordPress Multisite</w:t>
+        <w:t>14. Page Cache de origen (Origin Shield)</w:t>
+      </w:r>
+    </w:p>
+    <w:p>
+      <w:r>
+        <w:t>La Page Cache de origen guarda una copia del HTML de las páginas anónimas y la sirve antes de que arranque WordPress. Así, cuando la CDN tiene un MISS y va al origen, el origen no regenera WordPress entero: entrega la copia ya hecha. Es la red de seguridad que protege orígenes poco potentes.</w:t>
+      </w:r>
+    </w:p>
+    <w:p>
+      <w:r>
+        <w:t>A diferencia de un caché de página tradicional, está integrada con la CDN: una sola purga limpia a la vez el edge y esta caché de origen, así que nunca sirve contenido desactualizado por descoordinación entre capas.</w:t>
+      </w:r>
+    </w:p>
+    <w:p>
+      <w:pPr>
+        <w:pStyle w:val="Heading2"/>
+      </w:pPr>
+      <w:r>
+        <w:t>14.1. Cuándo activarla</w:t>
+      </w:r>
+    </w:p>
+    <w:p>
+      <w:r>
+        <w:t>Actívala si tu origen sufre cuando la CDN va a buscar contenido: tras una purga, con picos de tráfico, o con varios redactores trabajando a la vez. Es opcional y viene desactivada por defecto.</w:t>
+      </w:r>
+    </w:p>
+    <w:p>
+      <w:pPr>
+        <w:pStyle w:val="Heading2"/>
+      </w:pPr>
+      <w:r>
+        <w:t>14.2. Backends de almacenamiento</w:t>
+      </w:r>
+    </w:p>
+    <w:p>
+      <w:r>
+        <w:t>Disco (por defecto): no requiere nada adicional y funciona en cualquier servidor. Cada lectura es un acceso a disco, así que en discos lentos o de red (NFS) y con mucha concurrencia puede penalizar.</w:t>
+      </w:r>
+    </w:p>
+    <w:p>
+      <w:r>
+        <w:t>Redis / Memcached: guardan en memoria, sin acceso a disco; más rápidos bajo concurrencia. Requieren tener el servicio instalado. Si ya usas Redis para el Object Cache, reutilizan su configuración.</w:t>
+      </w:r>
+    </w:p>
+    <w:p>
+      <w:r>
+        <w:t>💡 El panel te muestra el compromiso de cada opción al elegir el backend.</w:t>
+      </w:r>
+    </w:p>
+    <w:p>
+      <w:pPr>
+        <w:pStyle w:val="Heading2"/>
+      </w:pPr>
+      <w:r>
+        <w:t>14.3. Qué se cachea y qué no</w:t>
+      </w:r>
+    </w:p>
+    <w:p>
+      <w:r>
+        <w:t>Solo se cachean peticiones GET de visitantes anónimos. Nunca se cachea: usuarios logados, páginas que emiten Set-Cookie, errores 404, búsquedas, ni URLs con parámetros reales en la query. Se guarda una copia por tipo de dispositivo (escritorio / móvil / app), igual que el edge.</w:t>
+      </w:r>
+    </w:p>
+    <w:p>
+      <w:r>
+        <w:t>Para proteger orígenes frágiles, solo se cachean los dominios propios del sitio (allowlist de host) y se limita el tamaño de cada entrada.</w:t>
+      </w:r>
+    </w:p>
+    <w:p>
+      <w:pPr>
+        <w:pStyle w:val="Heading2"/>
+      </w:pPr>
+      <w:r>
+        <w:t>14.4. Activación y wp-config.php</w:t>
+      </w:r>
+    </w:p>
+    <w:p>
+      <w:r>
+        <w:t>Al activarla desde el Dashboard, el plugin crea el fichero advanced-cache.php y activa WP_CACHE en wp-config.php. Antes de tocar wp-config.php hace una copia de seguridad en una ubicación no accesible desde la web, y respeta cualquier WP_CACHE que hayas definido tú.</w:t>
+      </w:r>
+    </w:p>
+    <w:p>
+      <w:r>
+        <w:t>💡 Si wp-config.php no tiene permisos de escritura, el plugin te indica la línea exacta que debes añadir a mano.</w:t>
+      </w:r>
+    </w:p>
+    <w:p>
+      <w:pPr>
+        <w:pStyle w:val="Heading2"/>
+      </w:pPr>
+      <w:r>
+        <w:t>14.5. Invalidación</w:t>
+      </w:r>
+    </w:p>
+    <w:p>
+      <w:r>
+        <w:t>Cualquier purga del plugin limpia también esta caché. Una purga total la vacía entera; una purga de una noticia o de la portada limpia solo esas URLs, para que la red de seguridad no se quede fría en un medio que publica sin parar. El resto expira por su TTL, que es corto porque solo es una red de seguridad para los MISS del edge.</w:t>
+      </w:r>
+    </w:p>
+    <w:p>
+      <w:pPr>
+        <w:pStyle w:val="Heading2"/>
+      </w:pPr>
+      <w:r>
+        <w:t>14.6. Perfil de caché de portada</w:t>
+      </w:r>
+    </w:p>
+    <w:p>
+      <w:r>
+        <w:t>La portada es la URL más visitada y la que no puede fallar. Puedes darle su propia política —frescura corta más una ventana generosa de "servir mientras se revalida"— gestionada desde el plugin en lugar de a mano en el VCL. Se configura en la sección de Configuración de Caché y es ampliable a otras plantillas.</w:t>
+      </w:r>
+    </w:p>
+    <w:p>
+      <w:pPr>
+        <w:pStyle w:val="Heading2"/>
+      </w:pPr>
+      <w:r>
+        <w:t>14.7. Normalización de Vary (anti-fragmentación)</w:t>
+      </w:r>
+    </w:p>
+    <w:p>
+      <w:r>
+        <w:t>El plugin garantiza que el documento anónimo nunca varíe por Cookie ni User-Agent. Variar por cookie fragmenta la caché en un objeto distinto por cada cookie de analytics del visitante, lo que dispara los MISS. El plugin lo corrige en el origen, justo antes de enviar las cabeceras, aunque otro plugin o el tema intenten añadirlo.</w:t>
+      </w:r>
+    </w:p>
+    <w:p>
+      <w:pPr>
+        <w:pStyle w:val="Heading2"/>
+      </w:pPr>
+      <w:r>
+        <w:t>14.8. Guardián de cookies</w:t>
+      </w:r>
+    </w:p>
+    <w:p>
+      <w:r>
+        <w:t>En Configuración Avanzada encontrarás un snippet VCL (propose-only) que limpia las cookies no esenciales antes de la búsqueda en caché —para que una cookie de analytics o de consentimiento no fuerce un pass—, y un botón "Comprobar cookies" que sondea tu origen y avisa si emite Set-Cookie o Vary: Cookie en páginas anónimas.</w:t>
+      </w:r>
+    </w:p>
+    <w:p>
+      <w:pPr>
+        <w:pStyle w:val="Heading2"/>
+      </w:pPr>
+      <w:r>
+        <w:t>14.9. Servir en revalidación (grace / keep)</w:t>
+      </w:r>
+    </w:p>
+    <w:p>
+      <w:r>
+        <w:t>Para que el stale-while-revalidate que envía el plugin funcione de verdad, Varnish necesita tener grace/keep acordes. El plugin genera un snippet VCL (propose-only) que los deriva automáticamente del Cache-Control que emite; lo copias y lo aplicas desde tu panel. El plugin nunca despliega VCL por su cuenta.</w:t>
+      </w:r>
+    </w:p>
+    <w:p>
+      <w:pPr>
+        <w:pStyle w:val="Heading1"/>
+      </w:pPr>
+      <w:r>
+        <w:t>15. WordPress Multisite</w:t>
       </w:r>
     </w:p>
     <w:p>
@@ -7323,7 +7481,7 @@
         <w:pStyle w:val="Heading1"/>
       </w:pPr>
       <w:r>
-        <w:t xml:space="preserve">15. Resolución de Problemas</w:t>
+        <w:t>16. Resolución de Problemas</w:t>
       </w:r>
     </w:p>
     <w:p>
@@ -8130,7 +8288,7 @@
         <w:pStyle w:val="Heading1"/>
       </w:pPr>
       <w:r>
-        <w:t xml:space="preserve">16. Glosario</w:t>
+        <w:t>17. Glosario</w:t>
       </w:r>
     </w:p>
     <w:tbl>
@@ -9194,7 +9352,7 @@
         <w:pStyle w:val="Heading1"/>
       </w:pPr>
       <w:r>
-        <w:t xml:space="preserve">17. Soporte</w:t>
+        <w:t>18. Soporte</w:t>
       </w:r>
     </w:p>
     <w:p>

</xml_diff>

<commit_message>
docs: guia de usuario actualizada a 1.9
- Portada y cabecera a v1.9 (Octubre 2026).
- Object Cache: activacion turnkey y, sobre todo, Redis securizado
  (requirepass -> WP_REDIS_HOST/PORT/PASSWORD en wp-config.php; phpredis
  debe estar en PHP-FPM, no solo CLI); estados honestos del panel.
- Warm-up: lista priorizada en local (portada -> secciones -> recientes)
  con ritmo adaptativo, sin depender del sitemap.
- Nueva seccion 11.5: controles editoriales (revisiones y autoguardado).
- Fila de resolucion de problemas para Object Cache en rojo con Redis securizado.
</commit_message>
<xml_diff>
--- a/doc/guia-usuario-transparent-edge-cache.docx
+++ b/doc/guia-usuario-transparent-edge-cache.docx
@@ -99,7 +99,7 @@
           <w:sz w:val="22"/>
           <w:szCs w:val="22"/>
         </w:rPr>
-        <w:t xml:space="preserve">Versión 1.5 — Septiembre 2026</w:t>
+        <w:t xml:space="preserve">Versión 1.9 — Octubre 2026</w:t>
       </w:r>
     </w:p>
     <w:p>
@@ -4563,6 +4563,19 @@
           <w:sz w:val="22"/>
           <w:szCs w:val="22"/>
         </w:rPr>
+        <w:t xml:space="preserve">Desde la versión 1.9, cuando lanzas un precalentamiento completo el plugin construye su propia lista priorizada en local (portada → secciones → contenido reciente) en lugar de depender del sitemap, y la recorre con un ritmo adaptativo que acelera o frena según cómo responde tu servidor de origen, deteniéndose solo si detecta que el origen está sufriendo. Así el calentamiento protege el origen incluso en sitios muy grandes.</w:t>
+      </w:r>
+    </w:p>
+    <w:p>
+      <w:pPr>
+        <w:spacing w:after="160" w:line="276"/>
+      </w:pPr>
+      <w:r>
+        <w:rPr>
+          <w:rFonts w:ascii="Plus Jakarta Sans" w:cs="Plus Jakarta Sans" w:eastAsia="Plus Jakarta Sans" w:hAnsi="Plus Jakarta Sans"/>
+          <w:sz w:val="22"/>
+          <w:szCs w:val="22"/>
+        </w:rPr>
         <w:t xml:space="preserve">Ejemplo: al publicar una noticia en la categoría "Deportes", el plugin:</w:t>
       </w:r>
     </w:p>
@@ -5570,15 +5583,7 @@
           <w:sz w:val="22"/>
           <w:szCs w:val="22"/>
         </w:rPr>
-        <w:t xml:space="preserve"> para no penalizar el LCP. Si necesitas excluir un elemento concreto, añádele el atributo </w:t>
-      </w:r>
-      <w:r>
-        <w:rPr>
-          <w:rFonts w:ascii="Plus Jakarta Sans" w:cs="Plus Jakarta Sans" w:eastAsia="Plus Jakarta Sans" w:hAnsi="Plus Jakarta Sans"/>
-          <w:sz w:val="22"/>
-          <w:szCs w:val="22"/>
-        </w:rPr>
-        <w:t xml:space="preserve">data-no-lazy</w:t>
+        <w:t xml:space="preserve"> para no penalizar el LCP. Si necesitas excluir un elemento concreto, añádele el atributo data-no-lazy</w:t>
       </w:r>
     </w:p>
     <w:p>
@@ -6450,6 +6455,27 @@
       <w:pPr>
         <w:spacing w:after="200"/>
       </w:pPr>
+    </w:p>
+    <w:p>
+      <w:pPr>
+        <w:pStyle w:val="Heading2"/>
+      </w:pPr>
+      <w:r>
+        <w:t xml:space="preserve">11.5. Controles editoriales (revisiones y autoguardado)</w:t>
+      </w:r>
+    </w:p>
+    <w:p>
+      <w:pPr>
+        <w:spacing w:after="160" w:line="276"/>
+      </w:pPr>
+      <w:r>
+        <w:rPr>
+          <w:rFonts w:ascii="Plus Jakarta Sans" w:cs="Plus Jakarta Sans" w:eastAsia="Plus Jakarta Sans" w:hAnsi="Plus Jakarta Sans"/>
+          <w:sz w:val="22"/>
+          <w:szCs w:val="22"/>
+        </w:rPr>
+        <w:t xml:space="preserve">Los controles editoriales, desactivados por defecto, ayudan a contener el crecimiento de la base de datos en redacciones con mucha edición. Al activarlos, el plugin limita cuántas revisiones conserva WordPress por entrada y ajusta el intervalo de autoguardado, de modo que no se acumulen cientos de revisiones por noticia. Son ajustes conservadores y opcionales; actívalos solo si tu flujo editorial genera mucho historial.</w:t>
+      </w:r>
     </w:p>
     <w:p>
       <w:pPr>
@@ -7080,6 +7106,42 @@
           <w:sz w:val="22"/>
           <w:szCs w:val="22"/>
         </w:rPr>
+      </w:r>
+    </w:p>
+    <w:p>
+      <w:pPr>
+        <w:spacing w:after="160" w:line="276"/>
+      </w:pPr>
+      <w:r>
+        <w:rPr>
+          <w:rFonts w:ascii="Plus Jakarta Sans" w:cs="Plus Jakarta Sans" w:eastAsia="Plus Jakarta Sans" w:hAnsi="Plus Jakarta Sans"/>
+          <w:sz w:val="22"/>
+          <w:szCs w:val="22"/>
+        </w:rPr>
+        <w:t xml:space="preserve">Desde la versión 1.9 la activación es turnkey: el plugin detecta el backend disponible, gestiona por ti el fichero object-cache.php y muestra en el Dashboard el estado real de la caché — verde cuando es persistente y está activa, "No persistente" si el backend se ha caído (en ese caso vuelve con seguridad a la caché en memoria del proceso, sin romper el sitio) y "Bloqueado" si otro plugin ya había instalado su propio object-cache.php, con un botón "Reemplazar" que hace una copia de seguridad del anterior antes de sustituirlo.</w:t>
+      </w:r>
+    </w:p>
+    <w:p>
+      <w:pPr>
+        <w:spacing w:after="160" w:line="276"/>
+      </w:pPr>
+      <w:r>
+        <w:rPr>
+          <w:rFonts w:ascii="Plus Jakarta Sans" w:cs="Plus Jakarta Sans" w:eastAsia="Plus Jakarta Sans" w:hAnsi="Plus Jakarta Sans"/>
+          <w:b/>
+          <w:bCs/>
+          <w:sz w:val="22"/>
+          <w:szCs w:val="22"/>
+        </w:rPr>
+        <w:t xml:space="preserve">Redis con contraseña (instalaciones securizadas): </w:t>
+      </w:r>
+      <w:r>
+        <w:rPr>
+          <w:rFonts w:ascii="Plus Jakarta Sans" w:cs="Plus Jakarta Sans" w:eastAsia="Plus Jakarta Sans" w:hAnsi="Plus Jakarta Sans"/>
+          <w:sz w:val="22"/>
+          <w:szCs w:val="22"/>
+        </w:rPr>
+        <w:t xml:space="preserve">si tu servidor Redis está protegido con contraseña (requirepass), debes declararla en wp-config.php mediante las constantes WP_REDIS_HOST, WP_REDIS_PORT y WP_REDIS_PASSWORD. Sin ella, el panel lo indica de forma honesta ("requiere autenticación") y no activa la caché. Además, la extensión phpredis debe estar disponible en PHP-FPM —el proceso que sirve las páginas—, no solo en la línea de comandos (CLI).</w:t>
       </w:r>
     </w:p>
     <w:p>
@@ -8021,6 +8083,92 @@
                 <w:szCs w:val="20"/>
               </w:rPr>
               <w:t xml:space="preserve">Contacta con tu proveedor de hosting para instalar la extensión PHP de Redis.</w:t>
+            </w:r>
+          </w:p>
+        </w:tc>
+      </w:tr>
+      <w:tr>
+        <w:tc>
+          <w:tcPr>
+            <w:tcW w:type="dxa" w:w="2500"/>
+            <w:tcBorders>
+              <w:top w:val="single" w:color="E2E2E2" w:sz="1"/>
+              <w:left w:val="single" w:color="E2E2E2" w:sz="1"/>
+              <w:bottom w:val="single" w:color="E2E2E2" w:sz="1"/>
+              <w:right w:val="single" w:color="E2E2E2" w:sz="1"/>
+            </w:tcBorders>
+            <w:shd w:fill="F0F4F8" w:val="clear"/>
+            <w:tcMar>
+              <w:top w:type="dxa" w:w="80"/>
+              <w:left w:type="dxa" w:w="120"/>
+              <w:bottom w:type="dxa" w:w="80"/>
+              <w:right w:type="dxa" w:w="120"/>
+            </w:tcMar>
+          </w:tcPr>
+          <w:p>
+            <w:r>
+              <w:rPr>
+                <w:rFonts w:ascii="Plus Jakarta Sans" w:cs="Plus Jakarta Sans" w:eastAsia="Plus Jakarta Sans" w:hAnsi="Plus Jakarta Sans"/>
+                <w:sz w:val="20"/>
+                <w:szCs w:val="20"/>
+              </w:rPr>
+              <w:t xml:space="preserve">Object Cache en rojo con Redis activo</w:t>
+            </w:r>
+          </w:p>
+        </w:tc>
+        <w:tc>
+          <w:tcPr>
+            <w:tcW w:type="dxa" w:w="2500"/>
+            <w:tcBorders>
+              <w:top w:val="single" w:color="E2E2E2" w:sz="1"/>
+              <w:left w:val="single" w:color="E2E2E2" w:sz="1"/>
+              <w:bottom w:val="single" w:color="E2E2E2" w:sz="1"/>
+              <w:right w:val="single" w:color="E2E2E2" w:sz="1"/>
+            </w:tcBorders>
+            <w:shd w:fill="F0F4F8" w:val="clear"/>
+            <w:tcMar>
+              <w:top w:type="dxa" w:w="80"/>
+              <w:left w:type="dxa" w:w="120"/>
+              <w:bottom w:type="dxa" w:w="80"/>
+              <w:right w:type="dxa" w:w="120"/>
+            </w:tcMar>
+          </w:tcPr>
+          <w:p>
+            <w:r>
+              <w:rPr>
+                <w:rFonts w:ascii="Plus Jakarta Sans" w:cs="Plus Jakarta Sans" w:eastAsia="Plus Jakarta Sans" w:hAnsi="Plus Jakarta Sans"/>
+                <w:sz w:val="20"/>
+                <w:szCs w:val="20"/>
+              </w:rPr>
+              <w:t xml:space="preserve">Redis tiene contraseña y falta WP_REDIS_PASSWORD, o phpredis no está en PHP-FPM</w:t>
+            </w:r>
+          </w:p>
+        </w:tc>
+        <w:tc>
+          <w:tcPr>
+            <w:tcW w:type="dxa" w:w="4000"/>
+            <w:tcBorders>
+              <w:top w:val="single" w:color="E2E2E2" w:sz="1"/>
+              <w:left w:val="single" w:color="E2E2E2" w:sz="1"/>
+              <w:bottom w:val="single" w:color="E2E2E2" w:sz="1"/>
+              <w:right w:val="single" w:color="E2E2E2" w:sz="1"/>
+            </w:tcBorders>
+            <w:shd w:fill="F0F4F8" w:val="clear"/>
+            <w:tcMar>
+              <w:top w:type="dxa" w:w="80"/>
+              <w:left w:type="dxa" w:w="120"/>
+              <w:bottom w:type="dxa" w:w="80"/>
+              <w:right w:type="dxa" w:w="120"/>
+            </w:tcMar>
+          </w:tcPr>
+          <w:p>
+            <w:r>
+              <w:rPr>
+                <w:rFonts w:ascii="Plus Jakarta Sans" w:cs="Plus Jakarta Sans" w:eastAsia="Plus Jakarta Sans" w:hAnsi="Plus Jakarta Sans"/>
+                <w:sz w:val="20"/>
+                <w:szCs w:val="20"/>
+              </w:rPr>
+              <w:t xml:space="preserve">Añade WP_REDIS_HOST, WP_REDIS_PORT y WP_REDIS_PASSWORD en wp-config.php. Verifica que la extensión phpredis está cargada en PHP-FPM, no solo en la CLI.</w:t>
             </w:r>
           </w:p>
         </w:tc>
@@ -9671,7 +9819,7 @@
         <w:sz w:val="16"/>
         <w:szCs w:val="16"/>
       </w:rPr>
-      <w:t xml:space="preserve">Transparent Edge Cache — Guía de Usuario v1.5</w:t>
+      <w:t xml:space="preserve">Transparent Edge Cache — Guía de Usuario v1.9</w:t>
     </w:r>
   </w:p>
 </w:hdr>

</xml_diff>

<commit_message>
v1.12.0: content-negotiation variant + query-string normalization
- Page cache can store a content-negotiation variant (e.g. a Markdown
  representation for AI agents) under its own cache key and serve it to the
  requests the edge marks, without colliding with the HTML entry. Opt-in,
  off by default.
- Optional query-string normalization: unknown parameters collapse to the
  clean URL and are served from cache, using an allowlist of content-varying
  parameters; search is bypassed. Opt-in, off by default.
- User guide updated to 1.12.
</commit_message>
<xml_diff>
--- a/doc/guia-usuario-transparent-edge-cache.docx
+++ b/doc/guia-usuario-transparent-edge-cache.docx
@@ -99,7 +99,7 @@
           <w:sz w:val="22"/>
           <w:szCs w:val="22"/>
         </w:rPr>
-        <w:t xml:space="preserve">Versión 1.9 — Octubre 2026</w:t>
+        <w:t xml:space="preserve">Versión 1.12 — Octubre 2026</w:t>
       </w:r>
     </w:p>
     <w:p>
@@ -7330,6 +7330,86 @@
     <w:p>
       <w:r>
         <w:t>Para que el stale-while-revalidate que envía el plugin funcione de verdad, Varnish necesita tener grace/keep acordes. El plugin genera un snippet VCL (propose-only) que los deriva automáticamente del Cache-Control que emite; lo copias y lo aplicas desde tu panel. El plugin nunca despliega VCL por su cuenta.</w:t>
+      </w:r>
+    </w:p>
+    <w:p>
+      <w:pPr>
+        <w:pStyle w:val="Heading2"/>
+      </w:pPr>
+      <w:r>
+        <w:t>14.10. Variante de negociación de contenido (Markdown para agentes de IA)</w:t>
+      </w:r>
+    </w:p>
+    <w:p>
+      <w:r>
+        <w:t xml:space="preserve">Algunos temas sirven una versión Markdown de cada página, pensada para agentes de IA y negociada por la cabecera Accept sobre la misma URL. Por defecto, la caché de página guarda una sola representación por URL —la HTML— y se la serviría también a los agentes. Esta opción permite que la caché guarde y sirva una segunda variante, la Markdown, bajo su propia clave, sin mezclarla con la HTML.</w:t>
+      </w:r>
+    </w:p>
+    <w:p>
+      <w:r>
+        <w:t xml:space="preserve">Se activa en la pestaña Avanzado, en el campo «Content-negotiation Variant Header», escribiendo el nombre de la cabecera que el edge añade cuando detecta una petición Markdown (por ejemplo X-Accept-Markdown). Dejarlo vacío mantiene el comportamiento por defecto: una sola variante.</w:t>
+      </w:r>
+    </w:p>
+    <w:p>
+      <w:r>
+        <w:t xml:space="preserve">Cuando llega esa cabecera con valor «1», la caché añade un sufijo a la clave, de modo que la variante Markdown y la HTML conviven en entradas separadas y ninguna desplaza a la otra. La invalidación de una URL borra ambas.</w:t>
+      </w:r>
+    </w:p>
+    <w:p>
+      <w:r>
+        <w:rPr>
+          <w:b/>
+          <w:bCs/>
+        </w:rPr>
+        <w:t xml:space="preserve">Requisito (importante): </w:t>
+      </w:r>
+      <w:r>
+        <w:t xml:space="preserve">el edge debe eliminar (unset) esa cabecera en la petición entrante antes de ponerla él mismo según su propia negociación de contenido. Si no lo hace, cualquier cliente podría enviarla y elegir por su cuenta qué variante recibe. Por eso esta opción solo debe activarse en sitios cuyo VCL realiza ese unset. Es opt-in y está apagada por defecto.</w:t>
+      </w:r>
+    </w:p>
+    <w:p>
+      <w:r>
+        <w:t xml:space="preserve">Nota de ocupación: cada URL que un agente pida en Markdown ocupará una segunda entrada en la caché (HTML y Markdown). Solo afecta a las URLs realmente solicitadas por agentes y solo en los sitios que activen la opción; el precalentamiento no la amplía, porque calienta únicamente la variante HTML.</w:t>
+      </w:r>
+    </w:p>
+    <w:p>
+      <w:pPr>
+        <w:pStyle w:val="Heading2"/>
+      </w:pPr>
+      <w:r>
+        <w:t>14.11. Normalización de query strings (opt-in)</w:t>
+      </w:r>
+    </w:p>
+    <w:p>
+      <w:r>
+        <w:t xml:space="preserve">La clave de la caché de página incluye la query string. Por defecto, una URL con un parámetro no reconocido —por ejemplo /pagina/?zz=1— se considera distinta y no se sirve de caché: arranca WordPress. Es el comportamiento conservador y seguro por defecto, el mismo que adoptan W3 Total Cache o WP Rocket, pero deja una vía para forzar arranques de origen añadiendo parámetros arbitrarios a una URL.</w:t>
+      </w:r>
+    </w:p>
+    <w:p>
+      <w:r>
+        <w:t xml:space="preserve">La opción «Normalize Query Strings» (pestaña Avanzado) cierra esa vía. Con ella activa, la caché conserva en la clave únicamente los parámetros de una lista blanca —los que de verdad cambian la página— y descarta el resto, de modo que /pagina/?zz=1 normaliza a /pagina/ y se sirve de caché. La lista blanca ya incluye los parámetros de contenido de WordPress (p, page_id, paged, cat, tag, author…) y se amplía con los propios del sitio en el campo «Content Query Strings».</w:t>
+      </w:r>
+    </w:p>
+    <w:p>
+      <w:r>
+        <w:t xml:space="preserve">La búsqueda (?s=) se trata aparte: nunca se cachea, se deja pasar siempre (bypass), para no servir la portada por error ni llenar la caché con una entrada por cada término de búsqueda.</w:t>
+      </w:r>
+    </w:p>
+    <w:p>
+      <w:r>
+        <w:rPr>
+          <w:b/>
+          <w:bCs/>
+        </w:rPr>
+        <w:t xml:space="preserve">Aviso (importante): </w:t>
+      </w:r>
+      <w:r>
+        <w:t xml:space="preserve">no actives esta opción en sitios donde algún parámetro de query sí cambia el contenido y no está en la lista blanca: filtros de WooCommerce, búsquedas por facetas, paginaciones o endpoints propios basados en query. En esos sitios, normalizar serviría la página sin filtrar. Es apropiada en sitios «brochure» —una web corporativa, por ejemplo— donde ningún parámetro arbitrario cambia lo que se muestra. Es opt-in y está apagada por defecto.</w:t>
+      </w:r>
+    </w:p>
+    <w:p>
+      <w:r>
+        <w:t xml:space="preserve">Relación con «Query Strings ignorados» (sección 11.3): aquella lista solo quita parámetros de marketing conocidos (utm_*, fbclid…) para mejorar el hit ratio sin riesgo. La normalización va un paso más allá y colapsa también los parámetros desconocidos, por eso exige conocer el sitio y es opt-in.</w:t>
       </w:r>
     </w:p>
     <w:p>
@@ -9819,7 +9899,7 @@
         <w:sz w:val="16"/>
         <w:szCs w:val="16"/>
       </w:rPr>
-      <w:t xml:space="preserve">Transparent Edge Cache — Guía de Usuario v1.9</w:t>
+      <w:t xml:space="preserve">Transparent Edge Cache — Guía de Usuario v1.12</w:t>
     </w:r>
   </w:p>
 </w:hdr>

</xml_diff>